<commit_message>
fix(conformance): explicit A4 sectPr in corpus fixtures — engines now agree on page setup
Fixtures had no valid sectPr (and no w:body wrapper for it), so DS defaulted
to A4 while LibreOffice defaulted to Letter — pure noise for the oracle.
generate-corpus.py now emits w:body + sectPr (A4, 1-inch margins).

All 30 fixtures regenerated; LO truths, wo-docx-renderer engine snapshots and
OnlyOffice goldens recaptured. 13/30 cases at fidelity 1.0; remaining deltas
are real signal (DS font substitution, mixed-fonts space artifact).
</commit_message>
<xml_diff>
--- a/core/crates/wo-conformance/corpus/cases/01-single-paragraph.docx
+++ b/core/crates/wo-conformance/corpus/cases/01-single-paragraph.docx
@@ -7,6 +7,10 @@
         <w:t>Hello World</w:t>
       </w:r>
     </w:p>
+    <w:sectPr>
+      <w:pgSz w:w="11906" w:h="16838"/>
+      <w:pgMar w:top="1440" w:right="1440" w:bottom="1440" w:left="1440" w:header="720" w:footer="720" w:gutter="0"/>
+    </w:sectPr>
   </w:body>
 </w:document>
 </file>
</xml_diff>